<commit_message>
fix: align timeline checklist and display semantics
Co-authored-by: Cursor <cursoragent@cursor.com>
</commit_message>
<xml_diff>
--- a/samples/INC-20260808-001-数据与网络安全事件调查分析报告.docx
+++ b/samples/INC-20260808-001-数据与网络安全事件调查分析报告.docx
@@ -593,7 +593,7 @@
                 <w:sz w:val="20"/>
                 <w:szCs w:val="20"/>
               </w:rPr>
-              <w:t xml:space="preserve">2026-08-08 23:43:56</w:t>
+              <w:t xml:space="preserve">2026-08-08 23:59:07</w:t>
             </w:r>
           </w:p>
         </w:tc>
@@ -2291,7 +2291,7 @@
           <w:sz w:val="22"/>
           <w:szCs w:val="22"/>
         </w:rPr>
-        <w:t xml:space="preserve">事件处置过程共记录 3 条（含人工处置记录），详见下表。</w:t>
+        <w:t xml:space="preserve">事件时间线共记录 2 条（含系统与人工补充的事件事实），详见下表。</w:t>
       </w:r>
     </w:p>
     <w:tbl>
@@ -2548,7 +2548,7 @@
                 <w:sz w:val="20"/>
                 <w:szCs w:val="20"/>
               </w:rPr>
-              <w:t xml:space="preserve">CRM_PROD.customer_info 被批量查询约 182,391 条记录。</w:t>
+              <w:t xml:space="preserve">CRM_PROD.customer_info 被批量查询约 182,391 条记录（大批量敏感数据访问）。</w:t>
             </w:r>
           </w:p>
         </w:tc>
@@ -2593,7 +2593,7 @@
                 <w:sz w:val="18"/>
                 <w:szCs w:val="18"/>
               </w:rPr>
-              <w:t xml:space="preserve">09:40:00</w:t>
+              <w:t xml:space="preserve">10:10:00</w:t>
             </w:r>
           </w:p>
         </w:tc>
@@ -2645,7 +2645,7 @@
                 <w:sz w:val="20"/>
                 <w:szCs w:val="20"/>
               </w:rPr>
-              <w:t xml:space="preserve">人工处置</w:t>
+              <w:t xml:space="preserve">其他</w:t>
             </w:r>
           </w:p>
         </w:tc>
@@ -2671,130 +2671,7 @@
                 <w:sz w:val="20"/>
                 <w:szCs w:val="20"/>
               </w:rPr>
-              <w:t xml:space="preserve">研判人员核查业务上下文，检索到变更工单 CHG-20260808-003。</w:t>
-            </w:r>
-          </w:p>
-        </w:tc>
-      </w:tr>
-      <w:tr>
-        <w:trPr>
-          <w:cantSplit/>
-        </w:trPr>
-        <w:tc>
-          <w:tcPr>
-            <w:tcW w:type="dxa" w:w="1814"/>
-            <w:tcMar>
-              <w:top w:type="dxa" w:w="90"/>
-              <w:left w:type="dxa" w:w="110"/>
-              <w:bottom w:type="dxa" w:w="90"/>
-              <w:right w:type="dxa" w:w="110"/>
-            </w:tcMar>
-            <w:vAlign w:val="center"/>
-          </w:tcPr>
-          <w:p>
-            <w:pPr>
-              <w:spacing w:after="20" w:line="300" w:lineRule="auto"/>
-            </w:pPr>
-            <w:r>
-              <w:rPr>
-                <w:rFonts w:ascii="SimSun" w:eastAsia="SimSun" w:hAnsi="SimSun"/>
-                <w:color w:val="000000"/>
-                <w:sz w:val="20"/>
-                <w:szCs w:val="20"/>
-              </w:rPr>
-              <w:t xml:space="preserve">2026-08-08</w:t>
-            </w:r>
-          </w:p>
-          <w:p>
-            <w:pPr>
-              <w:spacing w:after="20" w:line="300" w:lineRule="auto"/>
-            </w:pPr>
-            <w:r>
-              <w:rPr>
-                <w:rFonts w:ascii="SimSun" w:eastAsia="SimSun" w:hAnsi="SimSun"/>
-                <w:color w:val="595959"/>
-                <w:sz w:val="18"/>
-                <w:szCs w:val="18"/>
-              </w:rPr>
-              <w:t xml:space="preserve">10:10:00</w:t>
-            </w:r>
-          </w:p>
-        </w:tc>
-        <w:tc>
-          <w:tcPr>
-            <w:tcW w:type="dxa" w:w="1452"/>
-            <w:tcMar>
-              <w:top w:type="dxa" w:w="90"/>
-              <w:left w:type="dxa" w:w="110"/>
-              <w:bottom w:type="dxa" w:w="90"/>
-              <w:right w:type="dxa" w:w="110"/>
-            </w:tcMar>
-            <w:vAlign w:val="center"/>
-          </w:tcPr>
-          <w:p>
-            <w:pPr>
-              <w:spacing w:after="20" w:line="300" w:lineRule="auto"/>
-            </w:pPr>
-            <w:r>
-              <w:rPr>
-                <w:rFonts w:ascii="SimSun" w:eastAsia="SimSun" w:hAnsi="SimSun"/>
-                <w:color w:val="000000"/>
-                <w:sz w:val="20"/>
-                <w:szCs w:val="20"/>
-              </w:rPr>
-              <w:t xml:space="preserve">王研判</w:t>
-            </w:r>
-          </w:p>
-        </w:tc>
-        <w:tc>
-          <w:tcPr>
-            <w:tcW w:type="dxa" w:w="1270"/>
-            <w:tcMar>
-              <w:top w:type="dxa" w:w="90"/>
-              <w:left w:type="dxa" w:w="110"/>
-              <w:bottom w:type="dxa" w:w="90"/>
-              <w:right w:type="dxa" w:w="110"/>
-            </w:tcMar>
-            <w:vAlign w:val="center"/>
-          </w:tcPr>
-          <w:p>
-            <w:pPr>
-              <w:spacing w:after="20" w:line="300" w:lineRule="auto"/>
-            </w:pPr>
-            <w:r>
-              <w:rPr>
-                <w:rFonts w:ascii="SimSun" w:eastAsia="SimSun" w:hAnsi="SimSun"/>
-                <w:color w:val="000000"/>
-                <w:sz w:val="20"/>
-                <w:szCs w:val="20"/>
-              </w:rPr>
-              <w:t xml:space="preserve">人工处置</w:t>
-            </w:r>
-          </w:p>
-        </w:tc>
-        <w:tc>
-          <w:tcPr>
-            <w:tcW w:type="dxa" w:w="4536"/>
-            <w:tcMar>
-              <w:top w:type="dxa" w:w="90"/>
-              <w:left w:type="dxa" w:w="110"/>
-              <w:bottom w:type="dxa" w:w="90"/>
-              <w:right w:type="dxa" w:w="110"/>
-            </w:tcMar>
-            <w:vAlign w:val="center"/>
-          </w:tcPr>
-          <w:p>
-            <w:pPr>
-              <w:spacing w:after="20" w:line="300" w:lineRule="auto"/>
-            </w:pPr>
-            <w:r>
-              <w:rPr>
-                <w:rFonts w:ascii="SimSun" w:eastAsia="SimSun" w:hAnsi="SimSun"/>
-                <w:color w:val="000000"/>
-                <w:sz w:val="20"/>
-                <w:szCs w:val="20"/>
-              </w:rPr>
-              <w:t xml:space="preserve">李演示确认本次查询属于授权数据迁移。</w:t>
+              <w:t xml:space="preserve">业务负责人李演示确认本次查询属于已批准的授权数据迁移。</w:t>
             </w:r>
           </w:p>
         </w:tc>

</xml_diff>

<commit_message>
feat: integrate compliance snapshots into report docx
Co-authored-by: Cursor <cursoragent@cursor.com>
</commit_message>
<xml_diff>
--- a/samples/INC-20260808-001-数据与网络安全事件调查分析报告.docx
+++ b/samples/INC-20260808-001-数据与网络安全事件调查分析报告.docx
@@ -593,7 +593,7 @@
                 <w:sz w:val="20"/>
                 <w:szCs w:val="20"/>
               </w:rPr>
-              <w:t xml:space="preserve">2026-08-09 23:10:05</w:t>
+              <w:t xml:space="preserve">2026-08-10 00:19:46</w:t>
             </w:r>
           </w:p>
         </w:tc>
@@ -2732,66 +2732,791 @@
           <w:sz w:val="28"/>
           <w:szCs w:val="28"/>
         </w:rPr>
-        <w:t xml:space="preserve">十二、人工研判结论</w:t>
-      </w:r>
-    </w:p>
-    <w:p>
-      <w:pPr>
-        <w:spacing w:after="110" w:line="348" w:lineRule="auto"/>
-      </w:pPr>
-      <w:r>
-        <w:rPr>
-          <w:rFonts w:ascii="SimSun" w:eastAsia="SimSun" w:hAnsi="SimSun"/>
-          <w:b/>
-          <w:bCs/>
-          <w:sz w:val="23"/>
-          <w:szCs w:val="23"/>
-        </w:rPr>
-        <w:t xml:space="preserve">最终结论：正常授权业务行为</w:t>
-      </w:r>
-    </w:p>
-    <w:p>
-      <w:pPr>
-        <w:spacing w:after="110" w:line="348" w:lineRule="auto"/>
-      </w:pPr>
-      <w:r>
-        <w:rPr>
-          <w:rFonts w:ascii="SimSun" w:eastAsia="SimSun" w:hAnsi="SimSun"/>
-          <w:b/>
-          <w:bCs/>
-          <w:sz w:val="23"/>
-          <w:szCs w:val="23"/>
-        </w:rPr>
-        <w:t xml:space="preserve">人工风险等级：低风险</w:t>
-      </w:r>
-    </w:p>
-    <w:p>
-      <w:pPr>
-        <w:spacing w:after="110" w:line="348" w:lineRule="auto"/>
-        <w:ind w:firstLine="440"/>
-      </w:pPr>
-      <w:r>
-        <w:rPr>
-          <w:rFonts w:ascii="SimSun" w:eastAsia="SimSun" w:hAnsi="SimSun"/>
-          <w:sz w:val="22"/>
-          <w:szCs w:val="22"/>
-        </w:rPr>
-        <w:t xml:space="preserve">研判说明：技术层面查询行为异常，但存在正式变更工单且业务负责人已确认，人工结论：正常授权业务行为。</w:t>
-      </w:r>
-    </w:p>
-    <w:p>
-      <w:pPr>
-        <w:spacing w:after="110" w:line="348" w:lineRule="auto"/>
-      </w:pPr>
-      <w:r>
-        <w:rPr>
-          <w:rFonts w:ascii="SimSun" w:eastAsia="SimSun" w:hAnsi="SimSun"/>
-          <w:b/>
-          <w:bCs/>
-          <w:sz w:val="23"/>
-          <w:szCs w:val="23"/>
-        </w:rPr>
-        <w:t xml:space="preserve">研判人员：王研判</w:t>
+        <w:t xml:space="preserve">十二、相关合规参考</w:t>
+      </w:r>
+    </w:p>
+    <w:p>
+      <w:pPr>
+        <w:spacing w:after="110" w:line="348" w:lineRule="auto"/>
+        <w:ind w:firstLine="440"/>
+      </w:pPr>
+      <w:r>
+        <w:rPr>
+          <w:rFonts w:ascii="SimSun" w:eastAsia="SimSun" w:hAnsi="SimSun"/>
+          <w:sz w:val="22"/>
+          <w:szCs w:val="22"/>
+        </w:rPr>
+        <w:t xml:space="preserve">说明：以下内容为案件报告生成时固化的合规参考快照，仅用于辅助核查可能相关的制度或标准要求；最终研判结论以人工确认为准，本报告不对行为作出法律责任或合规符合性认定。</w:t>
+      </w:r>
+    </w:p>
+    <w:p>
+      <w:pPr>
+        <w:spacing w:after="70" w:line="348" w:lineRule="auto"/>
+        <w:ind w:left="220"/>
+      </w:pPr>
+      <w:r>
+        <w:rPr>
+          <w:rFonts w:ascii="SimSun" w:eastAsia="SimSun" w:hAnsi="SimSun"/>
+          <w:sz w:val="22"/>
+          <w:szCs w:val="22"/>
+        </w:rPr>
+        <w:t xml:space="preserve">1. 《中华人民共和国网络安全法》（2025年修正版） / 第二十一条 防未经授权访问（要点）</w:t>
+      </w:r>
+    </w:p>
+    <w:p>
+      <w:pPr>
+        <w:spacing w:after="110" w:line="348" w:lineRule="auto"/>
+        <w:ind w:firstLine="440"/>
+      </w:pPr>
+      <w:r>
+        <w:rPr>
+          <w:rFonts w:ascii="SimSun" w:eastAsia="SimSun" w:hAnsi="SimSun"/>
+          <w:sz w:val="22"/>
+          <w:szCs w:val="22"/>
+        </w:rPr>
+        <w:t xml:space="preserve">关联程度：存在相关性。</w:t>
+      </w:r>
+    </w:p>
+    <w:p>
+      <w:pPr>
+        <w:spacing w:after="110" w:line="348" w:lineRule="auto"/>
+        <w:ind w:firstLine="440"/>
+      </w:pPr>
+      <w:r>
+        <w:rPr>
+          <w:rFonts w:ascii="SimSun" w:eastAsia="SimSun" w:hAnsi="SimSun"/>
+          <w:sz w:val="22"/>
+          <w:szCs w:val="22"/>
+        </w:rPr>
+        <w:t xml:space="preserve">说明：该条款与案件命中分析所关联的控制项存在知识映射，供人工进一步核实。</w:t>
+      </w:r>
+    </w:p>
+    <w:p>
+      <w:pPr>
+        <w:spacing w:after="110" w:line="348" w:lineRule="auto"/>
+        <w:ind w:firstLine="440"/>
+      </w:pPr>
+      <w:r>
+        <w:rPr>
+          <w:rFonts w:ascii="SimSun" w:eastAsia="SimSun" w:hAnsi="SimSun"/>
+          <w:sz w:val="22"/>
+          <w:szCs w:val="22"/>
+        </w:rPr>
+        <w:t xml:space="preserve">版本依据：案件日期 2026-08-08 适用版本 2025-amendment。</w:t>
+      </w:r>
+    </w:p>
+    <w:p>
+      <w:pPr>
+        <w:spacing w:after="110" w:line="348" w:lineRule="auto"/>
+        <w:ind w:firstLine="440"/>
+      </w:pPr>
+      <w:r>
+        <w:rPr>
+          <w:rFonts w:ascii="SimSun" w:eastAsia="SimSun" w:hAnsi="SimSun"/>
+          <w:sz w:val="22"/>
+          <w:szCs w:val="22"/>
+        </w:rPr>
+        <w:t xml:space="preserve">关联控制：CTRL-DATA-ACCESS-01。</w:t>
+      </w:r>
+    </w:p>
+    <w:p>
+      <w:pPr>
+        <w:spacing w:after="70" w:line="348" w:lineRule="auto"/>
+        <w:ind w:left="220"/>
+      </w:pPr>
+      <w:r>
+        <w:rPr>
+          <w:rFonts w:ascii="SimSun" w:eastAsia="SimSun" w:hAnsi="SimSun"/>
+          <w:sz w:val="22"/>
+          <w:szCs w:val="22"/>
+        </w:rPr>
+        <w:t xml:space="preserve">2. 《中华人民共和国网络安全法》（2025年修正版） / 第二十五条 网络安全事件应急预案</w:t>
+      </w:r>
+    </w:p>
+    <w:p>
+      <w:pPr>
+        <w:spacing w:after="110" w:line="348" w:lineRule="auto"/>
+        <w:ind w:firstLine="440"/>
+      </w:pPr>
+      <w:r>
+        <w:rPr>
+          <w:rFonts w:ascii="SimSun" w:eastAsia="SimSun" w:hAnsi="SimSun"/>
+          <w:sz w:val="22"/>
+          <w:szCs w:val="22"/>
+        </w:rPr>
+        <w:t xml:space="preserve">关联程度：存在相关性。</w:t>
+      </w:r>
+    </w:p>
+    <w:p>
+      <w:pPr>
+        <w:spacing w:after="110" w:line="348" w:lineRule="auto"/>
+        <w:ind w:firstLine="440"/>
+      </w:pPr>
+      <w:r>
+        <w:rPr>
+          <w:rFonts w:ascii="SimSun" w:eastAsia="SimSun" w:hAnsi="SimSun"/>
+          <w:sz w:val="22"/>
+          <w:szCs w:val="22"/>
+        </w:rPr>
+        <w:t xml:space="preserve">说明：该条款与案件命中分析所关联的控制项存在知识映射，供人工进一步核实。</w:t>
+      </w:r>
+    </w:p>
+    <w:p>
+      <w:pPr>
+        <w:spacing w:after="110" w:line="348" w:lineRule="auto"/>
+        <w:ind w:firstLine="440"/>
+      </w:pPr>
+      <w:r>
+        <w:rPr>
+          <w:rFonts w:ascii="SimSun" w:eastAsia="SimSun" w:hAnsi="SimSun"/>
+          <w:sz w:val="22"/>
+          <w:szCs w:val="22"/>
+        </w:rPr>
+        <w:t xml:space="preserve">版本依据：案件日期 2026-08-08 适用版本 2025-amendment。</w:t>
+      </w:r>
+    </w:p>
+    <w:p>
+      <w:pPr>
+        <w:spacing w:after="110" w:line="348" w:lineRule="auto"/>
+        <w:ind w:firstLine="440"/>
+      </w:pPr>
+      <w:r>
+        <w:rPr>
+          <w:rFonts w:ascii="SimSun" w:eastAsia="SimSun" w:hAnsi="SimSun"/>
+          <w:sz w:val="22"/>
+          <w:szCs w:val="22"/>
+        </w:rPr>
+        <w:t xml:space="preserve">关联控制：CTRL-INCIDENT-01。</w:t>
+      </w:r>
+    </w:p>
+    <w:p>
+      <w:pPr>
+        <w:spacing w:after="70" w:line="348" w:lineRule="auto"/>
+        <w:ind w:left="220"/>
+      </w:pPr>
+      <w:r>
+        <w:rPr>
+          <w:rFonts w:ascii="SimSun" w:eastAsia="SimSun" w:hAnsi="SimSun"/>
+          <w:sz w:val="22"/>
+          <w:szCs w:val="22"/>
+        </w:rPr>
+        <w:t xml:space="preserve">3. 《中华人民共和国网络安全法》（2025年修正版） / 第二十七条 禁止危害网络安全的活动</w:t>
+      </w:r>
+    </w:p>
+    <w:p>
+      <w:pPr>
+        <w:spacing w:after="110" w:line="348" w:lineRule="auto"/>
+        <w:ind w:firstLine="440"/>
+      </w:pPr>
+      <w:r>
+        <w:rPr>
+          <w:rFonts w:ascii="SimSun" w:eastAsia="SimSun" w:hAnsi="SimSun"/>
+          <w:sz w:val="22"/>
+          <w:szCs w:val="22"/>
+        </w:rPr>
+        <w:t xml:space="preserve">关联程度：存在相关性。</w:t>
+      </w:r>
+    </w:p>
+    <w:p>
+      <w:pPr>
+        <w:spacing w:after="110" w:line="348" w:lineRule="auto"/>
+        <w:ind w:firstLine="440"/>
+      </w:pPr>
+      <w:r>
+        <w:rPr>
+          <w:rFonts w:ascii="SimSun" w:eastAsia="SimSun" w:hAnsi="SimSun"/>
+          <w:sz w:val="22"/>
+          <w:szCs w:val="22"/>
+        </w:rPr>
+        <w:t xml:space="preserve">说明：该条款与案件命中分析所关联的控制项存在知识映射，供人工进一步核实。</w:t>
+      </w:r>
+    </w:p>
+    <w:p>
+      <w:pPr>
+        <w:spacing w:after="110" w:line="348" w:lineRule="auto"/>
+        <w:ind w:firstLine="440"/>
+      </w:pPr>
+      <w:r>
+        <w:rPr>
+          <w:rFonts w:ascii="SimSun" w:eastAsia="SimSun" w:hAnsi="SimSun"/>
+          <w:sz w:val="22"/>
+          <w:szCs w:val="22"/>
+        </w:rPr>
+        <w:t xml:space="preserve">版本依据：案件日期 2026-08-08 适用版本 2025-amendment。</w:t>
+      </w:r>
+    </w:p>
+    <w:p>
+      <w:pPr>
+        <w:spacing w:after="110" w:line="348" w:lineRule="auto"/>
+        <w:ind w:firstLine="440"/>
+      </w:pPr>
+      <w:r>
+        <w:rPr>
+          <w:rFonts w:ascii="SimSun" w:eastAsia="SimSun" w:hAnsi="SimSun"/>
+          <w:sz w:val="22"/>
+          <w:szCs w:val="22"/>
+        </w:rPr>
+        <w:t xml:space="preserve">关联控制：CTRL-INCIDENT-01。</w:t>
+      </w:r>
+    </w:p>
+    <w:p>
+      <w:pPr>
+        <w:spacing w:after="70" w:line="348" w:lineRule="auto"/>
+        <w:ind w:left="220"/>
+      </w:pPr>
+      <w:r>
+        <w:rPr>
+          <w:rFonts w:ascii="SimSun" w:eastAsia="SimSun" w:hAnsi="SimSun"/>
+          <w:sz w:val="22"/>
+          <w:szCs w:val="22"/>
+        </w:rPr>
+        <w:t xml:space="preserve">4. 《中华人民共和国数据安全法》（2021年公布施行） / 第二十一条 数据分类分级保护</w:t>
+      </w:r>
+    </w:p>
+    <w:p>
+      <w:pPr>
+        <w:spacing w:after="110" w:line="348" w:lineRule="auto"/>
+        <w:ind w:firstLine="440"/>
+      </w:pPr>
+      <w:r>
+        <w:rPr>
+          <w:rFonts w:ascii="SimSun" w:eastAsia="SimSun" w:hAnsi="SimSun"/>
+          <w:sz w:val="22"/>
+          <w:szCs w:val="22"/>
+        </w:rPr>
+        <w:t xml:space="preserve">关联程度：存在相关性。</w:t>
+      </w:r>
+    </w:p>
+    <w:p>
+      <w:pPr>
+        <w:spacing w:after="110" w:line="348" w:lineRule="auto"/>
+        <w:ind w:firstLine="440"/>
+      </w:pPr>
+      <w:r>
+        <w:rPr>
+          <w:rFonts w:ascii="SimSun" w:eastAsia="SimSun" w:hAnsi="SimSun"/>
+          <w:sz w:val="22"/>
+          <w:szCs w:val="22"/>
+        </w:rPr>
+        <w:t xml:space="preserve">说明：该条款与案件命中分析所关联的控制项存在知识映射，供人工进一步核实。</w:t>
+      </w:r>
+    </w:p>
+    <w:p>
+      <w:pPr>
+        <w:spacing w:after="110" w:line="348" w:lineRule="auto"/>
+        <w:ind w:firstLine="440"/>
+      </w:pPr>
+      <w:r>
+        <w:rPr>
+          <w:rFonts w:ascii="SimSun" w:eastAsia="SimSun" w:hAnsi="SimSun"/>
+          <w:sz w:val="22"/>
+          <w:szCs w:val="22"/>
+        </w:rPr>
+        <w:t xml:space="preserve">版本依据：案件日期 2026-08-08 适用版本 2021-original。</w:t>
+      </w:r>
+    </w:p>
+    <w:p>
+      <w:pPr>
+        <w:spacing w:after="110" w:line="348" w:lineRule="auto"/>
+        <w:ind w:firstLine="440"/>
+      </w:pPr>
+      <w:r>
+        <w:rPr>
+          <w:rFonts w:ascii="SimSun" w:eastAsia="SimSun" w:hAnsi="SimSun"/>
+          <w:sz w:val="22"/>
+          <w:szCs w:val="22"/>
+        </w:rPr>
+        <w:t xml:space="preserve">关联控制：CTRL-DATA-CLASSIFY-01。</w:t>
+      </w:r>
+    </w:p>
+    <w:p>
+      <w:pPr>
+        <w:spacing w:after="70" w:line="348" w:lineRule="auto"/>
+        <w:ind w:left="220"/>
+      </w:pPr>
+      <w:r>
+        <w:rPr>
+          <w:rFonts w:ascii="SimSun" w:eastAsia="SimSun" w:hAnsi="SimSun"/>
+          <w:sz w:val="22"/>
+          <w:szCs w:val="22"/>
+        </w:rPr>
+        <w:t xml:space="preserve">5. 《中华人民共和国数据安全法》（2021年公布施行） / 第二十七条 数据处理活动风险监测</w:t>
+      </w:r>
+    </w:p>
+    <w:p>
+      <w:pPr>
+        <w:spacing w:after="110" w:line="348" w:lineRule="auto"/>
+        <w:ind w:firstLine="440"/>
+      </w:pPr>
+      <w:r>
+        <w:rPr>
+          <w:rFonts w:ascii="SimSun" w:eastAsia="SimSun" w:hAnsi="SimSun"/>
+          <w:sz w:val="22"/>
+          <w:szCs w:val="22"/>
+        </w:rPr>
+        <w:t xml:space="preserve">关联程度：存在相关性。</w:t>
+      </w:r>
+    </w:p>
+    <w:p>
+      <w:pPr>
+        <w:spacing w:after="110" w:line="348" w:lineRule="auto"/>
+        <w:ind w:firstLine="440"/>
+      </w:pPr>
+      <w:r>
+        <w:rPr>
+          <w:rFonts w:ascii="SimSun" w:eastAsia="SimSun" w:hAnsi="SimSun"/>
+          <w:sz w:val="22"/>
+          <w:szCs w:val="22"/>
+        </w:rPr>
+        <w:t xml:space="preserve">说明：该条款与案件命中分析所关联的控制项存在知识映射，供人工进一步核实。</w:t>
+      </w:r>
+    </w:p>
+    <w:p>
+      <w:pPr>
+        <w:spacing w:after="110" w:line="348" w:lineRule="auto"/>
+        <w:ind w:firstLine="440"/>
+      </w:pPr>
+      <w:r>
+        <w:rPr>
+          <w:rFonts w:ascii="SimSun" w:eastAsia="SimSun" w:hAnsi="SimSun"/>
+          <w:sz w:val="22"/>
+          <w:szCs w:val="22"/>
+        </w:rPr>
+        <w:t xml:space="preserve">版本依据：案件日期 2026-08-08 适用版本 2021-original。</w:t>
+      </w:r>
+    </w:p>
+    <w:p>
+      <w:pPr>
+        <w:spacing w:after="110" w:line="348" w:lineRule="auto"/>
+        <w:ind w:firstLine="440"/>
+      </w:pPr>
+      <w:r>
+        <w:rPr>
+          <w:rFonts w:ascii="SimSun" w:eastAsia="SimSun" w:hAnsi="SimSun"/>
+          <w:sz w:val="22"/>
+          <w:szCs w:val="22"/>
+        </w:rPr>
+        <w:t xml:space="preserve">关联控制：CTRL-BUSINESS-AUTH-01、CTRL-DATA-ACCESS-01。</w:t>
+      </w:r>
+    </w:p>
+    <w:p>
+      <w:pPr>
+        <w:spacing w:after="70" w:line="348" w:lineRule="auto"/>
+        <w:ind w:left="220"/>
+      </w:pPr>
+      <w:r>
+        <w:rPr>
+          <w:rFonts w:ascii="SimSun" w:eastAsia="SimSun" w:hAnsi="SimSun"/>
+          <w:sz w:val="22"/>
+          <w:szCs w:val="22"/>
+        </w:rPr>
+        <w:t xml:space="preserve">6. 《中华人民共和国数据安全法》（2021年公布施行） / 第二十九条 重要数据风险评估</w:t>
+      </w:r>
+    </w:p>
+    <w:p>
+      <w:pPr>
+        <w:spacing w:after="110" w:line="348" w:lineRule="auto"/>
+        <w:ind w:firstLine="440"/>
+      </w:pPr>
+      <w:r>
+        <w:rPr>
+          <w:rFonts w:ascii="SimSun" w:eastAsia="SimSun" w:hAnsi="SimSun"/>
+          <w:sz w:val="22"/>
+          <w:szCs w:val="22"/>
+        </w:rPr>
+        <w:t xml:space="preserve">关联程度：存在相关性。</w:t>
+      </w:r>
+    </w:p>
+    <w:p>
+      <w:pPr>
+        <w:spacing w:after="110" w:line="348" w:lineRule="auto"/>
+        <w:ind w:firstLine="440"/>
+      </w:pPr>
+      <w:r>
+        <w:rPr>
+          <w:rFonts w:ascii="SimSun" w:eastAsia="SimSun" w:hAnsi="SimSun"/>
+          <w:sz w:val="22"/>
+          <w:szCs w:val="22"/>
+        </w:rPr>
+        <w:t xml:space="preserve">说明：该条款与案件命中分析所关联的控制项存在知识映射，供人工进一步核实。</w:t>
+      </w:r>
+    </w:p>
+    <w:p>
+      <w:pPr>
+        <w:spacing w:after="110" w:line="348" w:lineRule="auto"/>
+        <w:ind w:firstLine="440"/>
+      </w:pPr>
+      <w:r>
+        <w:rPr>
+          <w:rFonts w:ascii="SimSun" w:eastAsia="SimSun" w:hAnsi="SimSun"/>
+          <w:sz w:val="22"/>
+          <w:szCs w:val="22"/>
+        </w:rPr>
+        <w:t xml:space="preserve">版本依据：案件日期 2026-08-08 适用版本 2021-original。</w:t>
+      </w:r>
+    </w:p>
+    <w:p>
+      <w:pPr>
+        <w:spacing w:after="110" w:line="348" w:lineRule="auto"/>
+        <w:ind w:firstLine="440"/>
+      </w:pPr>
+      <w:r>
+        <w:rPr>
+          <w:rFonts w:ascii="SimSun" w:eastAsia="SimSun" w:hAnsi="SimSun"/>
+          <w:sz w:val="22"/>
+          <w:szCs w:val="22"/>
+        </w:rPr>
+        <w:t xml:space="preserve">关联控制：CTRL-INCIDENT-01。</w:t>
+      </w:r>
+    </w:p>
+    <w:p>
+      <w:pPr>
+        <w:spacing w:after="70" w:line="348" w:lineRule="auto"/>
+        <w:ind w:left="220"/>
+      </w:pPr>
+      <w:r>
+        <w:rPr>
+          <w:rFonts w:ascii="SimSun" w:eastAsia="SimSun" w:hAnsi="SimSun"/>
+          <w:sz w:val="22"/>
+          <w:szCs w:val="22"/>
+        </w:rPr>
+        <w:t xml:space="preserve">7. 《信息安全技术 网络安全等级保护基本要求（GB/T 22239-2019）》（GB/T 22239-2019） / 访问控制（精选要求）</w:t>
+      </w:r>
+    </w:p>
+    <w:p>
+      <w:pPr>
+        <w:spacing w:after="110" w:line="348" w:lineRule="auto"/>
+        <w:ind w:firstLine="440"/>
+      </w:pPr>
+      <w:r>
+        <w:rPr>
+          <w:rFonts w:ascii="SimSun" w:eastAsia="SimSun" w:hAnsi="SimSun"/>
+          <w:sz w:val="22"/>
+          <w:szCs w:val="22"/>
+        </w:rPr>
+        <w:t xml:space="preserve">关联程度：存在相关性。</w:t>
+      </w:r>
+    </w:p>
+    <w:p>
+      <w:pPr>
+        <w:spacing w:after="110" w:line="348" w:lineRule="auto"/>
+        <w:ind w:firstLine="440"/>
+      </w:pPr>
+      <w:r>
+        <w:rPr>
+          <w:rFonts w:ascii="SimSun" w:eastAsia="SimSun" w:hAnsi="SimSun"/>
+          <w:sz w:val="22"/>
+          <w:szCs w:val="22"/>
+        </w:rPr>
+        <w:t xml:space="preserve">引用说明：本条为标准/制度要求摘要或控制参考，非全文原文引用；详细条文请核验官方标准文本。</w:t>
+      </w:r>
+    </w:p>
+    <w:p>
+      <w:pPr>
+        <w:spacing w:after="110" w:line="348" w:lineRule="auto"/>
+        <w:ind w:firstLine="440"/>
+      </w:pPr>
+      <w:r>
+        <w:rPr>
+          <w:rFonts w:ascii="SimSun" w:eastAsia="SimSun" w:hAnsi="SimSun"/>
+          <w:sz w:val="22"/>
+          <w:szCs w:val="22"/>
+        </w:rPr>
+        <w:t xml:space="preserve">版本依据：案件日期 2026-08-08 适用版本 2019。</w:t>
+      </w:r>
+    </w:p>
+    <w:p>
+      <w:pPr>
+        <w:spacing w:after="110" w:line="348" w:lineRule="auto"/>
+        <w:ind w:firstLine="440"/>
+      </w:pPr>
+      <w:r>
+        <w:rPr>
+          <w:rFonts w:ascii="SimSun" w:eastAsia="SimSun" w:hAnsi="SimSun"/>
+          <w:sz w:val="22"/>
+          <w:szCs w:val="22"/>
+        </w:rPr>
+        <w:t xml:space="preserve">关联控制：CTRL-DATA-ACCESS-01。</w:t>
+      </w:r>
+    </w:p>
+    <w:p>
+      <w:pPr>
+        <w:spacing w:after="70" w:line="348" w:lineRule="auto"/>
+        <w:ind w:left="220"/>
+      </w:pPr>
+      <w:r>
+        <w:rPr>
+          <w:rFonts w:ascii="SimSun" w:eastAsia="SimSun" w:hAnsi="SimSun"/>
+          <w:sz w:val="22"/>
+          <w:szCs w:val="22"/>
+        </w:rPr>
+        <w:t xml:space="preserve">8. 《信息安全技术 网络安全等级保护基本要求（GB/T 22239-2019）》（GB/T 22239-2019） / 安全审计（精选要求）</w:t>
+      </w:r>
+    </w:p>
+    <w:p>
+      <w:pPr>
+        <w:spacing w:after="110" w:line="348" w:lineRule="auto"/>
+        <w:ind w:firstLine="440"/>
+      </w:pPr>
+      <w:r>
+        <w:rPr>
+          <w:rFonts w:ascii="SimSun" w:eastAsia="SimSun" w:hAnsi="SimSun"/>
+          <w:sz w:val="22"/>
+          <w:szCs w:val="22"/>
+        </w:rPr>
+        <w:t xml:space="preserve">关联程度：存在相关性。</w:t>
+      </w:r>
+    </w:p>
+    <w:p>
+      <w:pPr>
+        <w:spacing w:after="110" w:line="348" w:lineRule="auto"/>
+        <w:ind w:firstLine="440"/>
+      </w:pPr>
+      <w:r>
+        <w:rPr>
+          <w:rFonts w:ascii="SimSun" w:eastAsia="SimSun" w:hAnsi="SimSun"/>
+          <w:sz w:val="22"/>
+          <w:szCs w:val="22"/>
+        </w:rPr>
+        <w:t xml:space="preserve">引用说明：本条为标准/制度要求摘要或控制参考，非全文原文引用；详细条文请核验官方标准文本。</w:t>
+      </w:r>
+    </w:p>
+    <w:p>
+      <w:pPr>
+        <w:spacing w:after="110" w:line="348" w:lineRule="auto"/>
+        <w:ind w:firstLine="440"/>
+      </w:pPr>
+      <w:r>
+        <w:rPr>
+          <w:rFonts w:ascii="SimSun" w:eastAsia="SimSun" w:hAnsi="SimSun"/>
+          <w:sz w:val="22"/>
+          <w:szCs w:val="22"/>
+        </w:rPr>
+        <w:t xml:space="preserve">版本依据：案件日期 2026-08-08 适用版本 2019。</w:t>
+      </w:r>
+    </w:p>
+    <w:p>
+      <w:pPr>
+        <w:spacing w:after="110" w:line="348" w:lineRule="auto"/>
+        <w:ind w:firstLine="440"/>
+      </w:pPr>
+      <w:r>
+        <w:rPr>
+          <w:rFonts w:ascii="SimSun" w:eastAsia="SimSun" w:hAnsi="SimSun"/>
+          <w:sz w:val="22"/>
+          <w:szCs w:val="22"/>
+        </w:rPr>
+        <w:t xml:space="preserve">关联控制：CTRL-DATA-ACCESS-01。</w:t>
+      </w:r>
+    </w:p>
+    <w:p>
+      <w:pPr>
+        <w:spacing w:after="70" w:line="348" w:lineRule="auto"/>
+        <w:ind w:left="220"/>
+      </w:pPr>
+      <w:r>
+        <w:rPr>
+          <w:rFonts w:ascii="SimSun" w:eastAsia="SimSun" w:hAnsi="SimSun"/>
+          <w:sz w:val="22"/>
+          <w:szCs w:val="22"/>
+        </w:rPr>
+        <w:t xml:space="preserve">9. 《网络数据安全管理条例》（2024年公布（2025年施行）） / 第十一条 身份认证与权限管理</w:t>
+      </w:r>
+    </w:p>
+    <w:p>
+      <w:pPr>
+        <w:spacing w:after="110" w:line="348" w:lineRule="auto"/>
+        <w:ind w:firstLine="440"/>
+      </w:pPr>
+      <w:r>
+        <w:rPr>
+          <w:rFonts w:ascii="SimSun" w:eastAsia="SimSun" w:hAnsi="SimSun"/>
+          <w:sz w:val="22"/>
+          <w:szCs w:val="22"/>
+        </w:rPr>
+        <w:t xml:space="preserve">关联程度：存在相关性。</w:t>
+      </w:r>
+    </w:p>
+    <w:p>
+      <w:pPr>
+        <w:spacing w:after="110" w:line="348" w:lineRule="auto"/>
+        <w:ind w:firstLine="440"/>
+      </w:pPr>
+      <w:r>
+        <w:rPr>
+          <w:rFonts w:ascii="SimSun" w:eastAsia="SimSun" w:hAnsi="SimSun"/>
+          <w:sz w:val="22"/>
+          <w:szCs w:val="22"/>
+        </w:rPr>
+        <w:t xml:space="preserve">说明：该条款与案件命中分析所关联的控制项存在知识映射，供人工进一步核实。</w:t>
+      </w:r>
+    </w:p>
+    <w:p>
+      <w:pPr>
+        <w:spacing w:after="110" w:line="348" w:lineRule="auto"/>
+        <w:ind w:firstLine="440"/>
+      </w:pPr>
+      <w:r>
+        <w:rPr>
+          <w:rFonts w:ascii="SimSun" w:eastAsia="SimSun" w:hAnsi="SimSun"/>
+          <w:sz w:val="22"/>
+          <w:szCs w:val="22"/>
+        </w:rPr>
+        <w:t xml:space="preserve">版本依据：案件日期 2026-08-08 适用版本 2024-original。</w:t>
+      </w:r>
+    </w:p>
+    <w:p>
+      <w:pPr>
+        <w:spacing w:after="110" w:line="348" w:lineRule="auto"/>
+        <w:ind w:firstLine="440"/>
+      </w:pPr>
+      <w:r>
+        <w:rPr>
+          <w:rFonts w:ascii="SimSun" w:eastAsia="SimSun" w:hAnsi="SimSun"/>
+          <w:sz w:val="22"/>
+          <w:szCs w:val="22"/>
+        </w:rPr>
+        <w:t xml:space="preserve">关联控制：CTRL-DATA-ACCESS-01。</w:t>
+      </w:r>
+    </w:p>
+    <w:p>
+      <w:pPr>
+        <w:spacing w:after="70" w:line="348" w:lineRule="auto"/>
+        <w:ind w:left="220"/>
+      </w:pPr>
+      <w:r>
+        <w:rPr>
+          <w:rFonts w:ascii="SimSun" w:eastAsia="SimSun" w:hAnsi="SimSun"/>
+          <w:sz w:val="22"/>
+          <w:szCs w:val="22"/>
+        </w:rPr>
+        <w:t xml:space="preserve">10. 《中华人民共和国个人信息保护法》（2021年公布施行） / 第十三条 处理个人信息的合法性基础</w:t>
+      </w:r>
+    </w:p>
+    <w:p>
+      <w:pPr>
+        <w:spacing w:after="110" w:line="348" w:lineRule="auto"/>
+        <w:ind w:firstLine="440"/>
+      </w:pPr>
+      <w:r>
+        <w:rPr>
+          <w:rFonts w:ascii="SimSun" w:eastAsia="SimSun" w:hAnsi="SimSun"/>
+          <w:sz w:val="22"/>
+          <w:szCs w:val="22"/>
+        </w:rPr>
+        <w:t xml:space="preserve">关联程度：存在相关性。</w:t>
+      </w:r>
+    </w:p>
+    <w:p>
+      <w:pPr>
+        <w:spacing w:after="110" w:line="348" w:lineRule="auto"/>
+        <w:ind w:firstLine="440"/>
+      </w:pPr>
+      <w:r>
+        <w:rPr>
+          <w:rFonts w:ascii="SimSun" w:eastAsia="SimSun" w:hAnsi="SimSun"/>
+          <w:sz w:val="22"/>
+          <w:szCs w:val="22"/>
+        </w:rPr>
+        <w:t xml:space="preserve">说明：该条款与案件命中分析所关联的控制项存在知识映射，供人工进一步核实。</w:t>
+      </w:r>
+    </w:p>
+    <w:p>
+      <w:pPr>
+        <w:spacing w:after="110" w:line="348" w:lineRule="auto"/>
+        <w:ind w:firstLine="440"/>
+      </w:pPr>
+      <w:r>
+        <w:rPr>
+          <w:rFonts w:ascii="SimSun" w:eastAsia="SimSun" w:hAnsi="SimSun"/>
+          <w:sz w:val="22"/>
+          <w:szCs w:val="22"/>
+        </w:rPr>
+        <w:t xml:space="preserve">版本依据：案件日期 2026-08-08 适用版本 2021-original。</w:t>
+      </w:r>
+    </w:p>
+    <w:p>
+      <w:pPr>
+        <w:spacing w:after="110" w:line="348" w:lineRule="auto"/>
+        <w:ind w:firstLine="440"/>
+      </w:pPr>
+      <w:r>
+        <w:rPr>
+          <w:rFonts w:ascii="SimSun" w:eastAsia="SimSun" w:hAnsi="SimSun"/>
+          <w:sz w:val="22"/>
+          <w:szCs w:val="22"/>
+        </w:rPr>
+        <w:t xml:space="preserve">关联控制：CTRL-BUSINESS-AUTH-01。</w:t>
+      </w:r>
+    </w:p>
+    <w:p>
+      <w:pPr>
+        <w:spacing w:after="70" w:line="348" w:lineRule="auto"/>
+        <w:ind w:left="220"/>
+      </w:pPr>
+      <w:r>
+        <w:rPr>
+          <w:rFonts w:ascii="SimSun" w:eastAsia="SimSun" w:hAnsi="SimSun"/>
+          <w:sz w:val="22"/>
+          <w:szCs w:val="22"/>
+        </w:rPr>
+        <w:t xml:space="preserve">11. 《中华人民共和国个人信息保护法》（2021年公布施行） / 第五十一条 个人信息安全技术与管理措施</w:t>
+      </w:r>
+    </w:p>
+    <w:p>
+      <w:pPr>
+        <w:spacing w:after="110" w:line="348" w:lineRule="auto"/>
+        <w:ind w:firstLine="440"/>
+      </w:pPr>
+      <w:r>
+        <w:rPr>
+          <w:rFonts w:ascii="SimSun" w:eastAsia="SimSun" w:hAnsi="SimSun"/>
+          <w:sz w:val="22"/>
+          <w:szCs w:val="22"/>
+        </w:rPr>
+        <w:t xml:space="preserve">关联程度：存在相关性。</w:t>
+      </w:r>
+    </w:p>
+    <w:p>
+      <w:pPr>
+        <w:spacing w:after="110" w:line="348" w:lineRule="auto"/>
+        <w:ind w:firstLine="440"/>
+      </w:pPr>
+      <w:r>
+        <w:rPr>
+          <w:rFonts w:ascii="SimSun" w:eastAsia="SimSun" w:hAnsi="SimSun"/>
+          <w:sz w:val="22"/>
+          <w:szCs w:val="22"/>
+        </w:rPr>
+        <w:t xml:space="preserve">说明：该条款与案件命中分析所关联的控制项存在知识映射，供人工进一步核实。</w:t>
+      </w:r>
+    </w:p>
+    <w:p>
+      <w:pPr>
+        <w:spacing w:after="110" w:line="348" w:lineRule="auto"/>
+        <w:ind w:firstLine="440"/>
+      </w:pPr>
+      <w:r>
+        <w:rPr>
+          <w:rFonts w:ascii="SimSun" w:eastAsia="SimSun" w:hAnsi="SimSun"/>
+          <w:sz w:val="22"/>
+          <w:szCs w:val="22"/>
+        </w:rPr>
+        <w:t xml:space="preserve">版本依据：案件日期 2026-08-08 适用版本 2021-original。</w:t>
+      </w:r>
+    </w:p>
+    <w:p>
+      <w:pPr>
+        <w:spacing w:after="110" w:line="348" w:lineRule="auto"/>
+        <w:ind w:firstLine="440"/>
+      </w:pPr>
+      <w:r>
+        <w:rPr>
+          <w:rFonts w:ascii="SimSun" w:eastAsia="SimSun" w:hAnsi="SimSun"/>
+          <w:sz w:val="22"/>
+          <w:szCs w:val="22"/>
+        </w:rPr>
+        <w:t xml:space="preserve">关联控制：CTRL-DATA-ACCESS-01。</w:t>
       </w:r>
     </w:p>
     <w:p>
@@ -2807,7 +3532,170 @@
           <w:sz w:val="28"/>
           <w:szCs w:val="28"/>
         </w:rPr>
-        <w:t xml:space="preserve">十三、整改建议</w:t>
+        <w:t xml:space="preserve">十三、可能相关要求</w:t>
+      </w:r>
+    </w:p>
+    <w:p>
+      <w:pPr>
+        <w:spacing w:after="110" w:line="348" w:lineRule="auto"/>
+        <w:ind w:firstLine="440"/>
+      </w:pPr>
+      <w:r>
+        <w:rPr>
+          <w:rFonts w:ascii="SimSun" w:eastAsia="SimSun" w:hAnsi="SimSun"/>
+          <w:sz w:val="22"/>
+          <w:szCs w:val="22"/>
+        </w:rPr>
+        <w:t xml:space="preserve">说明：以下内容为案件报告生成时固化的合规参考快照，仅用于辅助核查可能相关的制度或标准要求；最终研判结论以人工确认为准，本报告不对行为作出法律责任或合规符合性认定。</w:t>
+      </w:r>
+    </w:p>
+    <w:p>
+      <w:pPr>
+        <w:spacing w:after="110" w:line="348" w:lineRule="auto"/>
+        <w:ind w:firstLine="440"/>
+      </w:pPr>
+      <w:r>
+        <w:rPr>
+          <w:rFonts w:ascii="SimSun" w:eastAsia="SimSun" w:hAnsi="SimSun"/>
+          <w:sz w:val="22"/>
+          <w:szCs w:val="22"/>
+        </w:rPr>
+        <w:t xml:space="preserve">当前证据下未形成“可能涉及”的合规要求条目。</w:t>
+      </w:r>
+    </w:p>
+    <w:p>
+      <w:pPr>
+        <w:keepNext/>
+        <w:spacing w:after="150" w:before="300"/>
+      </w:pPr>
+      <w:r>
+        <w:rPr>
+          <w:rFonts w:ascii="Microsoft YaHei" w:eastAsia="Microsoft YaHei" w:hAnsi="Microsoft YaHei"/>
+          <w:b/>
+          <w:bCs/>
+          <w:sz w:val="28"/>
+          <w:szCs w:val="28"/>
+        </w:rPr>
+        <w:t xml:space="preserve">十四、建议进一步核实事项</w:t>
+      </w:r>
+    </w:p>
+    <w:p>
+      <w:pPr>
+        <w:spacing w:after="110" w:line="348" w:lineRule="auto"/>
+        <w:ind w:firstLine="440"/>
+      </w:pPr>
+      <w:r>
+        <w:rPr>
+          <w:rFonts w:ascii="SimSun" w:eastAsia="SimSun" w:hAnsi="SimSun"/>
+          <w:sz w:val="22"/>
+          <w:szCs w:val="22"/>
+        </w:rPr>
+        <w:t xml:space="preserve">说明：以下内容为案件报告生成时固化的合规参考快照，仅用于辅助核查可能相关的制度或标准要求；最终研判结论以人工确认为准，本报告不对行为作出法律责任或合规符合性认定。</w:t>
+      </w:r>
+    </w:p>
+    <w:p>
+      <w:pPr>
+        <w:spacing w:after="110" w:line="348" w:lineRule="auto"/>
+        <w:ind w:firstLine="440"/>
+      </w:pPr>
+      <w:r>
+        <w:rPr>
+          <w:rFonts w:ascii="SimSun" w:eastAsia="SimSun" w:hAnsi="SimSun"/>
+          <w:sz w:val="22"/>
+          <w:szCs w:val="22"/>
+        </w:rPr>
+        <w:t xml:space="preserve">当前无因缺少必要上下文而暂无法判断的合规条目。</w:t>
+      </w:r>
+    </w:p>
+    <w:p>
+      <w:pPr>
+        <w:keepNext/>
+        <w:spacing w:after="150" w:before="300"/>
+      </w:pPr>
+      <w:r>
+        <w:rPr>
+          <w:rFonts w:ascii="Microsoft YaHei" w:eastAsia="Microsoft YaHei" w:hAnsi="Microsoft YaHei"/>
+          <w:b/>
+          <w:bCs/>
+          <w:sz w:val="28"/>
+          <w:szCs w:val="28"/>
+        </w:rPr>
+        <w:t xml:space="preserve">十五、人工研判结论</w:t>
+      </w:r>
+    </w:p>
+    <w:p>
+      <w:pPr>
+        <w:spacing w:after="110" w:line="348" w:lineRule="auto"/>
+      </w:pPr>
+      <w:r>
+        <w:rPr>
+          <w:rFonts w:ascii="SimSun" w:eastAsia="SimSun" w:hAnsi="SimSun"/>
+          <w:b/>
+          <w:bCs/>
+          <w:sz w:val="23"/>
+          <w:szCs w:val="23"/>
+        </w:rPr>
+        <w:t xml:space="preserve">最终结论：正常授权业务行为</w:t>
+      </w:r>
+    </w:p>
+    <w:p>
+      <w:pPr>
+        <w:spacing w:after="110" w:line="348" w:lineRule="auto"/>
+      </w:pPr>
+      <w:r>
+        <w:rPr>
+          <w:rFonts w:ascii="SimSun" w:eastAsia="SimSun" w:hAnsi="SimSun"/>
+          <w:b/>
+          <w:bCs/>
+          <w:sz w:val="23"/>
+          <w:szCs w:val="23"/>
+        </w:rPr>
+        <w:t xml:space="preserve">人工风险等级：低风险</w:t>
+      </w:r>
+    </w:p>
+    <w:p>
+      <w:pPr>
+        <w:spacing w:after="110" w:line="348" w:lineRule="auto"/>
+        <w:ind w:firstLine="440"/>
+      </w:pPr>
+      <w:r>
+        <w:rPr>
+          <w:rFonts w:ascii="SimSun" w:eastAsia="SimSun" w:hAnsi="SimSun"/>
+          <w:sz w:val="22"/>
+          <w:szCs w:val="22"/>
+        </w:rPr>
+        <w:t xml:space="preserve">研判说明：技术层面查询行为异常，但存在正式变更工单且业务负责人已确认，人工结论：正常授权业务行为。</w:t>
+      </w:r>
+    </w:p>
+    <w:p>
+      <w:pPr>
+        <w:spacing w:after="110" w:line="348" w:lineRule="auto"/>
+      </w:pPr>
+      <w:r>
+        <w:rPr>
+          <w:rFonts w:ascii="SimSun" w:eastAsia="SimSun" w:hAnsi="SimSun"/>
+          <w:b/>
+          <w:bCs/>
+          <w:sz w:val="23"/>
+          <w:szCs w:val="23"/>
+        </w:rPr>
+        <w:t xml:space="preserve">研判人员：王研判</w:t>
+      </w:r>
+    </w:p>
+    <w:p>
+      <w:pPr>
+        <w:keepNext/>
+        <w:spacing w:after="150" w:before="300"/>
+      </w:pPr>
+      <w:r>
+        <w:rPr>
+          <w:rFonts w:ascii="Microsoft YaHei" w:eastAsia="Microsoft YaHei" w:hAnsi="Microsoft YaHei"/>
+          <w:b/>
+          <w:bCs/>
+          <w:sz w:val="28"/>
+          <w:szCs w:val="28"/>
+        </w:rPr>
+        <w:t xml:space="preserve">16、整改建议</w:t>
       </w:r>
     </w:p>
     <w:p>

</xml_diff>

<commit_message>
feat: add Case UI compliance reference panel
Show server-resolved compliance findings on the case workbench with stratified Top-N, relevance groups, and collapsed audit details—without re-running knowledge resolution in the browser.

Co-authored-by: Cursor <cursoragent@cursor.com>
</commit_message>
<xml_diff>
--- a/samples/INC-20260808-001-数据与网络安全事件调查分析报告.docx
+++ b/samples/INC-20260808-001-数据与网络安全事件调查分析报告.docx
@@ -593,7 +593,7 @@
                 <w:sz w:val="20"/>
                 <w:szCs w:val="20"/>
               </w:rPr>
-              <w:t xml:space="preserve">2026-08-10 00:19:46</w:t>
+              <w:t xml:space="preserve">2026-08-10 00:28:10</w:t>
             </w:r>
           </w:p>
         </w:tc>
@@ -2830,7 +2830,7 @@
           <w:sz w:val="22"/>
           <w:szCs w:val="22"/>
         </w:rPr>
-        <w:t xml:space="preserve">2. 《中华人民共和国网络安全法》（2025年修正版） / 第二十五条 网络安全事件应急预案</w:t>
+        <w:t xml:space="preserve">2. 《中华人民共和国数据安全法》（2021年公布施行） / 第二十七条 数据处理活动风险监测</w:t>
       </w:r>
     </w:p>
     <w:p>
@@ -2872,21 +2872,21 @@
           <w:sz w:val="22"/>
           <w:szCs w:val="22"/>
         </w:rPr>
-        <w:t xml:space="preserve">版本依据：案件日期 2026-08-08 适用版本 2025-amendment。</w:t>
-      </w:r>
-    </w:p>
-    <w:p>
-      <w:pPr>
-        <w:spacing w:after="110" w:line="348" w:lineRule="auto"/>
-        <w:ind w:firstLine="440"/>
-      </w:pPr>
-      <w:r>
-        <w:rPr>
-          <w:rFonts w:ascii="SimSun" w:eastAsia="SimSun" w:hAnsi="SimSun"/>
-          <w:sz w:val="22"/>
-          <w:szCs w:val="22"/>
-        </w:rPr>
-        <w:t xml:space="preserve">关联控制：CTRL-INCIDENT-01。</w:t>
+        <w:t xml:space="preserve">版本依据：案件日期 2026-08-08 适用版本 2021-original。</w:t>
+      </w:r>
+    </w:p>
+    <w:p>
+      <w:pPr>
+        <w:spacing w:after="110" w:line="348" w:lineRule="auto"/>
+        <w:ind w:firstLine="440"/>
+      </w:pPr>
+      <w:r>
+        <w:rPr>
+          <w:rFonts w:ascii="SimSun" w:eastAsia="SimSun" w:hAnsi="SimSun"/>
+          <w:sz w:val="22"/>
+          <w:szCs w:val="22"/>
+        </w:rPr>
+        <w:t xml:space="preserve">关联控制：CTRL-BUSINESS-AUTH-01、CTRL-DATA-ACCESS-01。</w:t>
       </w:r>
     </w:p>
     <w:p>
@@ -2900,7 +2900,7 @@
           <w:sz w:val="22"/>
           <w:szCs w:val="22"/>
         </w:rPr>
-        <w:t xml:space="preserve">3. 《中华人民共和国网络安全法》（2025年修正版） / 第二十七条 禁止危害网络安全的活动</w:t>
+        <w:t xml:space="preserve">3. 《网络数据安全管理条例》（2024年公布（2025年施行）） / 第十一条 身份认证与权限管理</w:t>
       </w:r>
     </w:p>
     <w:p>
@@ -2942,21 +2942,21 @@
           <w:sz w:val="22"/>
           <w:szCs w:val="22"/>
         </w:rPr>
-        <w:t xml:space="preserve">版本依据：案件日期 2026-08-08 适用版本 2025-amendment。</w:t>
-      </w:r>
-    </w:p>
-    <w:p>
-      <w:pPr>
-        <w:spacing w:after="110" w:line="348" w:lineRule="auto"/>
-        <w:ind w:firstLine="440"/>
-      </w:pPr>
-      <w:r>
-        <w:rPr>
-          <w:rFonts w:ascii="SimSun" w:eastAsia="SimSun" w:hAnsi="SimSun"/>
-          <w:sz w:val="22"/>
-          <w:szCs w:val="22"/>
-        </w:rPr>
-        <w:t xml:space="preserve">关联控制：CTRL-INCIDENT-01。</w:t>
+        <w:t xml:space="preserve">版本依据：案件日期 2026-08-08 适用版本 2024-original。</w:t>
+      </w:r>
+    </w:p>
+    <w:p>
+      <w:pPr>
+        <w:spacing w:after="110" w:line="348" w:lineRule="auto"/>
+        <w:ind w:firstLine="440"/>
+      </w:pPr>
+      <w:r>
+        <w:rPr>
+          <w:rFonts w:ascii="SimSun" w:eastAsia="SimSun" w:hAnsi="SimSun"/>
+          <w:sz w:val="22"/>
+          <w:szCs w:val="22"/>
+        </w:rPr>
+        <w:t xml:space="preserve">关联控制：CTRL-DATA-ACCESS-01。</w:t>
       </w:r>
     </w:p>
     <w:p>
@@ -2970,7 +2970,7 @@
           <w:sz w:val="22"/>
           <w:szCs w:val="22"/>
         </w:rPr>
-        <w:t xml:space="preserve">4. 《中华人民共和国数据安全法》（2021年公布施行） / 第二十一条 数据分类分级保护</w:t>
+        <w:t xml:space="preserve">4. 《中华人民共和国个人信息保护法》（2021年公布施行） / 第十三条 处理个人信息的合法性基础</w:t>
       </w:r>
     </w:p>
     <w:p>
@@ -3026,497 +3026,7 @@
           <w:sz w:val="22"/>
           <w:szCs w:val="22"/>
         </w:rPr>
-        <w:t xml:space="preserve">关联控制：CTRL-DATA-CLASSIFY-01。</w:t>
-      </w:r>
-    </w:p>
-    <w:p>
-      <w:pPr>
-        <w:spacing w:after="70" w:line="348" w:lineRule="auto"/>
-        <w:ind w:left="220"/>
-      </w:pPr>
-      <w:r>
-        <w:rPr>
-          <w:rFonts w:ascii="SimSun" w:eastAsia="SimSun" w:hAnsi="SimSun"/>
-          <w:sz w:val="22"/>
-          <w:szCs w:val="22"/>
-        </w:rPr>
-        <w:t xml:space="preserve">5. 《中华人民共和国数据安全法》（2021年公布施行） / 第二十七条 数据处理活动风险监测</w:t>
-      </w:r>
-    </w:p>
-    <w:p>
-      <w:pPr>
-        <w:spacing w:after="110" w:line="348" w:lineRule="auto"/>
-        <w:ind w:firstLine="440"/>
-      </w:pPr>
-      <w:r>
-        <w:rPr>
-          <w:rFonts w:ascii="SimSun" w:eastAsia="SimSun" w:hAnsi="SimSun"/>
-          <w:sz w:val="22"/>
-          <w:szCs w:val="22"/>
-        </w:rPr>
-        <w:t xml:space="preserve">关联程度：存在相关性。</w:t>
-      </w:r>
-    </w:p>
-    <w:p>
-      <w:pPr>
-        <w:spacing w:after="110" w:line="348" w:lineRule="auto"/>
-        <w:ind w:firstLine="440"/>
-      </w:pPr>
-      <w:r>
-        <w:rPr>
-          <w:rFonts w:ascii="SimSun" w:eastAsia="SimSun" w:hAnsi="SimSun"/>
-          <w:sz w:val="22"/>
-          <w:szCs w:val="22"/>
-        </w:rPr>
-        <w:t xml:space="preserve">说明：该条款与案件命中分析所关联的控制项存在知识映射，供人工进一步核实。</w:t>
-      </w:r>
-    </w:p>
-    <w:p>
-      <w:pPr>
-        <w:spacing w:after="110" w:line="348" w:lineRule="auto"/>
-        <w:ind w:firstLine="440"/>
-      </w:pPr>
-      <w:r>
-        <w:rPr>
-          <w:rFonts w:ascii="SimSun" w:eastAsia="SimSun" w:hAnsi="SimSun"/>
-          <w:sz w:val="22"/>
-          <w:szCs w:val="22"/>
-        </w:rPr>
-        <w:t xml:space="preserve">版本依据：案件日期 2026-08-08 适用版本 2021-original。</w:t>
-      </w:r>
-    </w:p>
-    <w:p>
-      <w:pPr>
-        <w:spacing w:after="110" w:line="348" w:lineRule="auto"/>
-        <w:ind w:firstLine="440"/>
-      </w:pPr>
-      <w:r>
-        <w:rPr>
-          <w:rFonts w:ascii="SimSun" w:eastAsia="SimSun" w:hAnsi="SimSun"/>
-          <w:sz w:val="22"/>
-          <w:szCs w:val="22"/>
-        </w:rPr>
-        <w:t xml:space="preserve">关联控制：CTRL-BUSINESS-AUTH-01、CTRL-DATA-ACCESS-01。</w:t>
-      </w:r>
-    </w:p>
-    <w:p>
-      <w:pPr>
-        <w:spacing w:after="70" w:line="348" w:lineRule="auto"/>
-        <w:ind w:left="220"/>
-      </w:pPr>
-      <w:r>
-        <w:rPr>
-          <w:rFonts w:ascii="SimSun" w:eastAsia="SimSun" w:hAnsi="SimSun"/>
-          <w:sz w:val="22"/>
-          <w:szCs w:val="22"/>
-        </w:rPr>
-        <w:t xml:space="preserve">6. 《中华人民共和国数据安全法》（2021年公布施行） / 第二十九条 重要数据风险评估</w:t>
-      </w:r>
-    </w:p>
-    <w:p>
-      <w:pPr>
-        <w:spacing w:after="110" w:line="348" w:lineRule="auto"/>
-        <w:ind w:firstLine="440"/>
-      </w:pPr>
-      <w:r>
-        <w:rPr>
-          <w:rFonts w:ascii="SimSun" w:eastAsia="SimSun" w:hAnsi="SimSun"/>
-          <w:sz w:val="22"/>
-          <w:szCs w:val="22"/>
-        </w:rPr>
-        <w:t xml:space="preserve">关联程度：存在相关性。</w:t>
-      </w:r>
-    </w:p>
-    <w:p>
-      <w:pPr>
-        <w:spacing w:after="110" w:line="348" w:lineRule="auto"/>
-        <w:ind w:firstLine="440"/>
-      </w:pPr>
-      <w:r>
-        <w:rPr>
-          <w:rFonts w:ascii="SimSun" w:eastAsia="SimSun" w:hAnsi="SimSun"/>
-          <w:sz w:val="22"/>
-          <w:szCs w:val="22"/>
-        </w:rPr>
-        <w:t xml:space="preserve">说明：该条款与案件命中分析所关联的控制项存在知识映射，供人工进一步核实。</w:t>
-      </w:r>
-    </w:p>
-    <w:p>
-      <w:pPr>
-        <w:spacing w:after="110" w:line="348" w:lineRule="auto"/>
-        <w:ind w:firstLine="440"/>
-      </w:pPr>
-      <w:r>
-        <w:rPr>
-          <w:rFonts w:ascii="SimSun" w:eastAsia="SimSun" w:hAnsi="SimSun"/>
-          <w:sz w:val="22"/>
-          <w:szCs w:val="22"/>
-        </w:rPr>
-        <w:t xml:space="preserve">版本依据：案件日期 2026-08-08 适用版本 2021-original。</w:t>
-      </w:r>
-    </w:p>
-    <w:p>
-      <w:pPr>
-        <w:spacing w:after="110" w:line="348" w:lineRule="auto"/>
-        <w:ind w:firstLine="440"/>
-      </w:pPr>
-      <w:r>
-        <w:rPr>
-          <w:rFonts w:ascii="SimSun" w:eastAsia="SimSun" w:hAnsi="SimSun"/>
-          <w:sz w:val="22"/>
-          <w:szCs w:val="22"/>
-        </w:rPr>
-        <w:t xml:space="preserve">关联控制：CTRL-INCIDENT-01。</w:t>
-      </w:r>
-    </w:p>
-    <w:p>
-      <w:pPr>
-        <w:spacing w:after="70" w:line="348" w:lineRule="auto"/>
-        <w:ind w:left="220"/>
-      </w:pPr>
-      <w:r>
-        <w:rPr>
-          <w:rFonts w:ascii="SimSun" w:eastAsia="SimSun" w:hAnsi="SimSun"/>
-          <w:sz w:val="22"/>
-          <w:szCs w:val="22"/>
-        </w:rPr>
-        <w:t xml:space="preserve">7. 《信息安全技术 网络安全等级保护基本要求（GB/T 22239-2019）》（GB/T 22239-2019） / 访问控制（精选要求）</w:t>
-      </w:r>
-    </w:p>
-    <w:p>
-      <w:pPr>
-        <w:spacing w:after="110" w:line="348" w:lineRule="auto"/>
-        <w:ind w:firstLine="440"/>
-      </w:pPr>
-      <w:r>
-        <w:rPr>
-          <w:rFonts w:ascii="SimSun" w:eastAsia="SimSun" w:hAnsi="SimSun"/>
-          <w:sz w:val="22"/>
-          <w:szCs w:val="22"/>
-        </w:rPr>
-        <w:t xml:space="preserve">关联程度：存在相关性。</w:t>
-      </w:r>
-    </w:p>
-    <w:p>
-      <w:pPr>
-        <w:spacing w:after="110" w:line="348" w:lineRule="auto"/>
-        <w:ind w:firstLine="440"/>
-      </w:pPr>
-      <w:r>
-        <w:rPr>
-          <w:rFonts w:ascii="SimSun" w:eastAsia="SimSun" w:hAnsi="SimSun"/>
-          <w:sz w:val="22"/>
-          <w:szCs w:val="22"/>
-        </w:rPr>
-        <w:t xml:space="preserve">引用说明：本条为标准/制度要求摘要或控制参考，非全文原文引用；详细条文请核验官方标准文本。</w:t>
-      </w:r>
-    </w:p>
-    <w:p>
-      <w:pPr>
-        <w:spacing w:after="110" w:line="348" w:lineRule="auto"/>
-        <w:ind w:firstLine="440"/>
-      </w:pPr>
-      <w:r>
-        <w:rPr>
-          <w:rFonts w:ascii="SimSun" w:eastAsia="SimSun" w:hAnsi="SimSun"/>
-          <w:sz w:val="22"/>
-          <w:szCs w:val="22"/>
-        </w:rPr>
-        <w:t xml:space="preserve">版本依据：案件日期 2026-08-08 适用版本 2019。</w:t>
-      </w:r>
-    </w:p>
-    <w:p>
-      <w:pPr>
-        <w:spacing w:after="110" w:line="348" w:lineRule="auto"/>
-        <w:ind w:firstLine="440"/>
-      </w:pPr>
-      <w:r>
-        <w:rPr>
-          <w:rFonts w:ascii="SimSun" w:eastAsia="SimSun" w:hAnsi="SimSun"/>
-          <w:sz w:val="22"/>
-          <w:szCs w:val="22"/>
-        </w:rPr>
-        <w:t xml:space="preserve">关联控制：CTRL-DATA-ACCESS-01。</w:t>
-      </w:r>
-    </w:p>
-    <w:p>
-      <w:pPr>
-        <w:spacing w:after="70" w:line="348" w:lineRule="auto"/>
-        <w:ind w:left="220"/>
-      </w:pPr>
-      <w:r>
-        <w:rPr>
-          <w:rFonts w:ascii="SimSun" w:eastAsia="SimSun" w:hAnsi="SimSun"/>
-          <w:sz w:val="22"/>
-          <w:szCs w:val="22"/>
-        </w:rPr>
-        <w:t xml:space="preserve">8. 《信息安全技术 网络安全等级保护基本要求（GB/T 22239-2019）》（GB/T 22239-2019） / 安全审计（精选要求）</w:t>
-      </w:r>
-    </w:p>
-    <w:p>
-      <w:pPr>
-        <w:spacing w:after="110" w:line="348" w:lineRule="auto"/>
-        <w:ind w:firstLine="440"/>
-      </w:pPr>
-      <w:r>
-        <w:rPr>
-          <w:rFonts w:ascii="SimSun" w:eastAsia="SimSun" w:hAnsi="SimSun"/>
-          <w:sz w:val="22"/>
-          <w:szCs w:val="22"/>
-        </w:rPr>
-        <w:t xml:space="preserve">关联程度：存在相关性。</w:t>
-      </w:r>
-    </w:p>
-    <w:p>
-      <w:pPr>
-        <w:spacing w:after="110" w:line="348" w:lineRule="auto"/>
-        <w:ind w:firstLine="440"/>
-      </w:pPr>
-      <w:r>
-        <w:rPr>
-          <w:rFonts w:ascii="SimSun" w:eastAsia="SimSun" w:hAnsi="SimSun"/>
-          <w:sz w:val="22"/>
-          <w:szCs w:val="22"/>
-        </w:rPr>
-        <w:t xml:space="preserve">引用说明：本条为标准/制度要求摘要或控制参考，非全文原文引用；详细条文请核验官方标准文本。</w:t>
-      </w:r>
-    </w:p>
-    <w:p>
-      <w:pPr>
-        <w:spacing w:after="110" w:line="348" w:lineRule="auto"/>
-        <w:ind w:firstLine="440"/>
-      </w:pPr>
-      <w:r>
-        <w:rPr>
-          <w:rFonts w:ascii="SimSun" w:eastAsia="SimSun" w:hAnsi="SimSun"/>
-          <w:sz w:val="22"/>
-          <w:szCs w:val="22"/>
-        </w:rPr>
-        <w:t xml:space="preserve">版本依据：案件日期 2026-08-08 适用版本 2019。</w:t>
-      </w:r>
-    </w:p>
-    <w:p>
-      <w:pPr>
-        <w:spacing w:after="110" w:line="348" w:lineRule="auto"/>
-        <w:ind w:firstLine="440"/>
-      </w:pPr>
-      <w:r>
-        <w:rPr>
-          <w:rFonts w:ascii="SimSun" w:eastAsia="SimSun" w:hAnsi="SimSun"/>
-          <w:sz w:val="22"/>
-          <w:szCs w:val="22"/>
-        </w:rPr>
-        <w:t xml:space="preserve">关联控制：CTRL-DATA-ACCESS-01。</w:t>
-      </w:r>
-    </w:p>
-    <w:p>
-      <w:pPr>
-        <w:spacing w:after="70" w:line="348" w:lineRule="auto"/>
-        <w:ind w:left="220"/>
-      </w:pPr>
-      <w:r>
-        <w:rPr>
-          <w:rFonts w:ascii="SimSun" w:eastAsia="SimSun" w:hAnsi="SimSun"/>
-          <w:sz w:val="22"/>
-          <w:szCs w:val="22"/>
-        </w:rPr>
-        <w:t xml:space="preserve">9. 《网络数据安全管理条例》（2024年公布（2025年施行）） / 第十一条 身份认证与权限管理</w:t>
-      </w:r>
-    </w:p>
-    <w:p>
-      <w:pPr>
-        <w:spacing w:after="110" w:line="348" w:lineRule="auto"/>
-        <w:ind w:firstLine="440"/>
-      </w:pPr>
-      <w:r>
-        <w:rPr>
-          <w:rFonts w:ascii="SimSun" w:eastAsia="SimSun" w:hAnsi="SimSun"/>
-          <w:sz w:val="22"/>
-          <w:szCs w:val="22"/>
-        </w:rPr>
-        <w:t xml:space="preserve">关联程度：存在相关性。</w:t>
-      </w:r>
-    </w:p>
-    <w:p>
-      <w:pPr>
-        <w:spacing w:after="110" w:line="348" w:lineRule="auto"/>
-        <w:ind w:firstLine="440"/>
-      </w:pPr>
-      <w:r>
-        <w:rPr>
-          <w:rFonts w:ascii="SimSun" w:eastAsia="SimSun" w:hAnsi="SimSun"/>
-          <w:sz w:val="22"/>
-          <w:szCs w:val="22"/>
-        </w:rPr>
-        <w:t xml:space="preserve">说明：该条款与案件命中分析所关联的控制项存在知识映射，供人工进一步核实。</w:t>
-      </w:r>
-    </w:p>
-    <w:p>
-      <w:pPr>
-        <w:spacing w:after="110" w:line="348" w:lineRule="auto"/>
-        <w:ind w:firstLine="440"/>
-      </w:pPr>
-      <w:r>
-        <w:rPr>
-          <w:rFonts w:ascii="SimSun" w:eastAsia="SimSun" w:hAnsi="SimSun"/>
-          <w:sz w:val="22"/>
-          <w:szCs w:val="22"/>
-        </w:rPr>
-        <w:t xml:space="preserve">版本依据：案件日期 2026-08-08 适用版本 2024-original。</w:t>
-      </w:r>
-    </w:p>
-    <w:p>
-      <w:pPr>
-        <w:spacing w:after="110" w:line="348" w:lineRule="auto"/>
-        <w:ind w:firstLine="440"/>
-      </w:pPr>
-      <w:r>
-        <w:rPr>
-          <w:rFonts w:ascii="SimSun" w:eastAsia="SimSun" w:hAnsi="SimSun"/>
-          <w:sz w:val="22"/>
-          <w:szCs w:val="22"/>
-        </w:rPr>
-        <w:t xml:space="preserve">关联控制：CTRL-DATA-ACCESS-01。</w:t>
-      </w:r>
-    </w:p>
-    <w:p>
-      <w:pPr>
-        <w:spacing w:after="70" w:line="348" w:lineRule="auto"/>
-        <w:ind w:left="220"/>
-      </w:pPr>
-      <w:r>
-        <w:rPr>
-          <w:rFonts w:ascii="SimSun" w:eastAsia="SimSun" w:hAnsi="SimSun"/>
-          <w:sz w:val="22"/>
-          <w:szCs w:val="22"/>
-        </w:rPr>
-        <w:t xml:space="preserve">10. 《中华人民共和国个人信息保护法》（2021年公布施行） / 第十三条 处理个人信息的合法性基础</w:t>
-      </w:r>
-    </w:p>
-    <w:p>
-      <w:pPr>
-        <w:spacing w:after="110" w:line="348" w:lineRule="auto"/>
-        <w:ind w:firstLine="440"/>
-      </w:pPr>
-      <w:r>
-        <w:rPr>
-          <w:rFonts w:ascii="SimSun" w:eastAsia="SimSun" w:hAnsi="SimSun"/>
-          <w:sz w:val="22"/>
-          <w:szCs w:val="22"/>
-        </w:rPr>
-        <w:t xml:space="preserve">关联程度：存在相关性。</w:t>
-      </w:r>
-    </w:p>
-    <w:p>
-      <w:pPr>
-        <w:spacing w:after="110" w:line="348" w:lineRule="auto"/>
-        <w:ind w:firstLine="440"/>
-      </w:pPr>
-      <w:r>
-        <w:rPr>
-          <w:rFonts w:ascii="SimSun" w:eastAsia="SimSun" w:hAnsi="SimSun"/>
-          <w:sz w:val="22"/>
-          <w:szCs w:val="22"/>
-        </w:rPr>
-        <w:t xml:space="preserve">说明：该条款与案件命中分析所关联的控制项存在知识映射，供人工进一步核实。</w:t>
-      </w:r>
-    </w:p>
-    <w:p>
-      <w:pPr>
-        <w:spacing w:after="110" w:line="348" w:lineRule="auto"/>
-        <w:ind w:firstLine="440"/>
-      </w:pPr>
-      <w:r>
-        <w:rPr>
-          <w:rFonts w:ascii="SimSun" w:eastAsia="SimSun" w:hAnsi="SimSun"/>
-          <w:sz w:val="22"/>
-          <w:szCs w:val="22"/>
-        </w:rPr>
-        <w:t xml:space="preserve">版本依据：案件日期 2026-08-08 适用版本 2021-original。</w:t>
-      </w:r>
-    </w:p>
-    <w:p>
-      <w:pPr>
-        <w:spacing w:after="110" w:line="348" w:lineRule="auto"/>
-        <w:ind w:firstLine="440"/>
-      </w:pPr>
-      <w:r>
-        <w:rPr>
-          <w:rFonts w:ascii="SimSun" w:eastAsia="SimSun" w:hAnsi="SimSun"/>
-          <w:sz w:val="22"/>
-          <w:szCs w:val="22"/>
-        </w:rPr>
-        <w:t xml:space="preserve">关联控制：CTRL-BUSINESS-AUTH-01。</w:t>
-      </w:r>
-    </w:p>
-    <w:p>
-      <w:pPr>
-        <w:spacing w:after="70" w:line="348" w:lineRule="auto"/>
-        <w:ind w:left="220"/>
-      </w:pPr>
-      <w:r>
-        <w:rPr>
-          <w:rFonts w:ascii="SimSun" w:eastAsia="SimSun" w:hAnsi="SimSun"/>
-          <w:sz w:val="22"/>
-          <w:szCs w:val="22"/>
-        </w:rPr>
-        <w:t xml:space="preserve">11. 《中华人民共和国个人信息保护法》（2021年公布施行） / 第五十一条 个人信息安全技术与管理措施</w:t>
-      </w:r>
-    </w:p>
-    <w:p>
-      <w:pPr>
-        <w:spacing w:after="110" w:line="348" w:lineRule="auto"/>
-        <w:ind w:firstLine="440"/>
-      </w:pPr>
-      <w:r>
-        <w:rPr>
-          <w:rFonts w:ascii="SimSun" w:eastAsia="SimSun" w:hAnsi="SimSun"/>
-          <w:sz w:val="22"/>
-          <w:szCs w:val="22"/>
-        </w:rPr>
-        <w:t xml:space="preserve">关联程度：存在相关性。</w:t>
-      </w:r>
-    </w:p>
-    <w:p>
-      <w:pPr>
-        <w:spacing w:after="110" w:line="348" w:lineRule="auto"/>
-        <w:ind w:firstLine="440"/>
-      </w:pPr>
-      <w:r>
-        <w:rPr>
-          <w:rFonts w:ascii="SimSun" w:eastAsia="SimSun" w:hAnsi="SimSun"/>
-          <w:sz w:val="22"/>
-          <w:szCs w:val="22"/>
-        </w:rPr>
-        <w:t xml:space="preserve">说明：该条款与案件命中分析所关联的控制项存在知识映射，供人工进一步核实。</w:t>
-      </w:r>
-    </w:p>
-    <w:p>
-      <w:pPr>
-        <w:spacing w:after="110" w:line="348" w:lineRule="auto"/>
-        <w:ind w:firstLine="440"/>
-      </w:pPr>
-      <w:r>
-        <w:rPr>
-          <w:rFonts w:ascii="SimSun" w:eastAsia="SimSun" w:hAnsi="SimSun"/>
-          <w:sz w:val="22"/>
-          <w:szCs w:val="22"/>
-        </w:rPr>
-        <w:t xml:space="preserve">版本依据：案件日期 2026-08-08 适用版本 2021-original。</w:t>
-      </w:r>
-    </w:p>
-    <w:p>
-      <w:pPr>
-        <w:spacing w:after="110" w:line="348" w:lineRule="auto"/>
-        <w:ind w:firstLine="440"/>
-      </w:pPr>
-      <w:r>
-        <w:rPr>
-          <w:rFonts w:ascii="SimSun" w:eastAsia="SimSun" w:hAnsi="SimSun"/>
-          <w:sz w:val="22"/>
-          <w:szCs w:val="22"/>
-        </w:rPr>
-        <w:t xml:space="preserve">关联控制：CTRL-DATA-ACCESS-01。</w:t>
+        <w:t xml:space="preserve">关联控制：CTRL-BUSINESS-AUTH-01、CTRL-PRIVACY-01。</w:t>
       </w:r>
     </w:p>
     <w:p>
@@ -3551,16 +3061,142 @@
     </w:p>
     <w:p>
       <w:pPr>
-        <w:spacing w:after="110" w:line="348" w:lineRule="auto"/>
-        <w:ind w:firstLine="440"/>
-      </w:pPr>
-      <w:r>
-        <w:rPr>
-          <w:rFonts w:ascii="SimSun" w:eastAsia="SimSun" w:hAnsi="SimSun"/>
-          <w:sz w:val="22"/>
-          <w:szCs w:val="22"/>
-        </w:rPr>
-        <w:t xml:space="preserve">当前证据下未形成“可能涉及”的合规要求条目。</w:t>
+        <w:spacing w:after="70" w:line="348" w:lineRule="auto"/>
+        <w:ind w:left="220"/>
+      </w:pPr>
+      <w:r>
+        <w:rPr>
+          <w:rFonts w:ascii="SimSun" w:eastAsia="SimSun" w:hAnsi="SimSun"/>
+          <w:sz w:val="22"/>
+          <w:szCs w:val="22"/>
+        </w:rPr>
+        <w:t xml:space="preserve">1. 《网络数据安全管理条例》（2024年公布（2025年施行）） / 第二十七条 重要数据识别与保护</w:t>
+      </w:r>
+    </w:p>
+    <w:p>
+      <w:pPr>
+        <w:spacing w:after="110" w:line="348" w:lineRule="auto"/>
+        <w:ind w:firstLine="440"/>
+      </w:pPr>
+      <w:r>
+        <w:rPr>
+          <w:rFonts w:ascii="SimSun" w:eastAsia="SimSun" w:hAnsi="SimSun"/>
+          <w:sz w:val="22"/>
+          <w:szCs w:val="22"/>
+        </w:rPr>
+        <w:t xml:space="preserve">关联程度：可能涉及，需结合业务背景进一步确认。</w:t>
+      </w:r>
+    </w:p>
+    <w:p>
+      <w:pPr>
+        <w:spacing w:after="110" w:line="348" w:lineRule="auto"/>
+        <w:ind w:firstLine="440"/>
+      </w:pPr>
+      <w:r>
+        <w:rPr>
+          <w:rFonts w:ascii="SimSun" w:eastAsia="SimSun" w:hAnsi="SimSun"/>
+          <w:sz w:val="22"/>
+          <w:szCs w:val="22"/>
+        </w:rPr>
+        <w:t xml:space="preserve">说明：该条款与案件命中分析所关联的控制项存在知识映射，供人工进一步核实。</w:t>
+      </w:r>
+    </w:p>
+    <w:p>
+      <w:pPr>
+        <w:spacing w:after="110" w:line="348" w:lineRule="auto"/>
+        <w:ind w:firstLine="440"/>
+      </w:pPr>
+      <w:r>
+        <w:rPr>
+          <w:rFonts w:ascii="SimSun" w:eastAsia="SimSun" w:hAnsi="SimSun"/>
+          <w:sz w:val="22"/>
+          <w:szCs w:val="22"/>
+        </w:rPr>
+        <w:t xml:space="preserve">版本依据：案件日期 2026-08-08 适用版本 2024-original。</w:t>
+      </w:r>
+    </w:p>
+    <w:p>
+      <w:pPr>
+        <w:spacing w:after="110" w:line="348" w:lineRule="auto"/>
+        <w:ind w:firstLine="440"/>
+      </w:pPr>
+      <w:r>
+        <w:rPr>
+          <w:rFonts w:ascii="SimSun" w:eastAsia="SimSun" w:hAnsi="SimSun"/>
+          <w:sz w:val="22"/>
+          <w:szCs w:val="22"/>
+        </w:rPr>
+        <w:t xml:space="preserve">关联控制：CTRL-DATA-CLASSIFY-01。</w:t>
+      </w:r>
+    </w:p>
+    <w:p>
+      <w:pPr>
+        <w:spacing w:after="70" w:line="348" w:lineRule="auto"/>
+        <w:ind w:left="220"/>
+      </w:pPr>
+      <w:r>
+        <w:rPr>
+          <w:rFonts w:ascii="SimSun" w:eastAsia="SimSun" w:hAnsi="SimSun"/>
+          <w:sz w:val="22"/>
+          <w:szCs w:val="22"/>
+        </w:rPr>
+        <w:t xml:space="preserve">2. 《中华人民共和国个人信息保护法》（2021年公布施行） / 第二十一条 委托处理</w:t>
+      </w:r>
+    </w:p>
+    <w:p>
+      <w:pPr>
+        <w:spacing w:after="110" w:line="348" w:lineRule="auto"/>
+        <w:ind w:firstLine="440"/>
+      </w:pPr>
+      <w:r>
+        <w:rPr>
+          <w:rFonts w:ascii="SimSun" w:eastAsia="SimSun" w:hAnsi="SimSun"/>
+          <w:sz w:val="22"/>
+          <w:szCs w:val="22"/>
+        </w:rPr>
+        <w:t xml:space="preserve">关联程度：可能涉及，需结合业务背景进一步确认。</w:t>
+      </w:r>
+    </w:p>
+    <w:p>
+      <w:pPr>
+        <w:spacing w:after="110" w:line="348" w:lineRule="auto"/>
+        <w:ind w:firstLine="440"/>
+      </w:pPr>
+      <w:r>
+        <w:rPr>
+          <w:rFonts w:ascii="SimSun" w:eastAsia="SimSun" w:hAnsi="SimSun"/>
+          <w:sz w:val="22"/>
+          <w:szCs w:val="22"/>
+        </w:rPr>
+        <w:t xml:space="preserve">说明：该条款与案件命中分析所关联的控制项存在知识映射，供人工进一步核实。</w:t>
+      </w:r>
+    </w:p>
+    <w:p>
+      <w:pPr>
+        <w:spacing w:after="110" w:line="348" w:lineRule="auto"/>
+        <w:ind w:firstLine="440"/>
+      </w:pPr>
+      <w:r>
+        <w:rPr>
+          <w:rFonts w:ascii="SimSun" w:eastAsia="SimSun" w:hAnsi="SimSun"/>
+          <w:sz w:val="22"/>
+          <w:szCs w:val="22"/>
+        </w:rPr>
+        <w:t xml:space="preserve">版本依据：案件日期 2026-08-08 适用版本 2021-original。</w:t>
+      </w:r>
+    </w:p>
+    <w:p>
+      <w:pPr>
+        <w:spacing w:after="110" w:line="348" w:lineRule="auto"/>
+        <w:ind w:firstLine="440"/>
+      </w:pPr>
+      <w:r>
+        <w:rPr>
+          <w:rFonts w:ascii="SimSun" w:eastAsia="SimSun" w:hAnsi="SimSun"/>
+          <w:sz w:val="22"/>
+          <w:szCs w:val="22"/>
+        </w:rPr>
+        <w:t xml:space="preserve">关联控制：CTRL-PRIVACY-01。</w:t>
       </w:r>
     </w:p>
     <w:p>
@@ -3595,16 +3231,282 @@
     </w:p>
     <w:p>
       <w:pPr>
-        <w:spacing w:after="110" w:line="348" w:lineRule="auto"/>
-        <w:ind w:firstLine="440"/>
-      </w:pPr>
-      <w:r>
-        <w:rPr>
-          <w:rFonts w:ascii="SimSun" w:eastAsia="SimSun" w:hAnsi="SimSun"/>
-          <w:sz w:val="22"/>
-          <w:szCs w:val="22"/>
-        </w:rPr>
-        <w:t xml:space="preserve">当前无因缺少必要上下文而暂无法判断的合规条目。</w:t>
+        <w:spacing w:after="70" w:line="348" w:lineRule="auto"/>
+        <w:ind w:left="220"/>
+      </w:pPr>
+      <w:r>
+        <w:rPr>
+          <w:rFonts w:ascii="SimSun" w:eastAsia="SimSun" w:hAnsi="SimSun"/>
+          <w:sz w:val="22"/>
+          <w:szCs w:val="22"/>
+        </w:rPr>
+        <w:t xml:space="preserve">1. 《中华人民共和国网络安全法》（2025年修正版） / 第二十一条 网络安全等级保护与安全保护义务</w:t>
+      </w:r>
+    </w:p>
+    <w:p>
+      <w:pPr>
+        <w:spacing w:after="110" w:line="348" w:lineRule="auto"/>
+        <w:ind w:firstLine="440"/>
+      </w:pPr>
+      <w:r>
+        <w:rPr>
+          <w:rFonts w:ascii="SimSun" w:eastAsia="SimSun" w:hAnsi="SimSun"/>
+          <w:sz w:val="22"/>
+          <w:szCs w:val="22"/>
+        </w:rPr>
+        <w:t xml:space="preserve">关联程度：当前缺少必要上下文，暂无法判断。</w:t>
+      </w:r>
+    </w:p>
+    <w:p>
+      <w:pPr>
+        <w:spacing w:after="110" w:line="348" w:lineRule="auto"/>
+        <w:ind w:firstLine="440"/>
+      </w:pPr>
+      <w:r>
+        <w:rPr>
+          <w:rFonts w:ascii="SimSun" w:eastAsia="SimSun" w:hAnsi="SimSun"/>
+          <w:sz w:val="22"/>
+          <w:szCs w:val="22"/>
+        </w:rPr>
+        <w:t xml:space="preserve">说明：该条款与案件命中分析所关联的控制项存在知识映射，供人工进一步核实。</w:t>
+      </w:r>
+    </w:p>
+    <w:p>
+      <w:pPr>
+        <w:spacing w:after="110" w:line="348" w:lineRule="auto"/>
+        <w:ind w:firstLine="440"/>
+      </w:pPr>
+      <w:r>
+        <w:rPr>
+          <w:rFonts w:ascii="SimSun" w:eastAsia="SimSun" w:hAnsi="SimSun"/>
+          <w:sz w:val="22"/>
+          <w:szCs w:val="22"/>
+        </w:rPr>
+        <w:t xml:space="preserve">版本依据：案件日期 2026-08-08 适用版本 2025-amendment。</w:t>
+      </w:r>
+    </w:p>
+    <w:p>
+      <w:pPr>
+        <w:spacing w:after="110" w:line="348" w:lineRule="auto"/>
+        <w:ind w:firstLine="440"/>
+      </w:pPr>
+      <w:r>
+        <w:rPr>
+          <w:rFonts w:ascii="SimSun" w:eastAsia="SimSun" w:hAnsi="SimSun"/>
+          <w:sz w:val="22"/>
+          <w:szCs w:val="22"/>
+        </w:rPr>
+        <w:t xml:space="preserve">关联控制：CTRL-NETWORK-BOUNDARY-01。</w:t>
+      </w:r>
+    </w:p>
+    <w:p>
+      <w:pPr>
+        <w:spacing w:after="70" w:line="348" w:lineRule="auto"/>
+        <w:ind w:left="220"/>
+      </w:pPr>
+      <w:r>
+        <w:rPr>
+          <w:rFonts w:ascii="SimSun" w:eastAsia="SimSun" w:hAnsi="SimSun"/>
+          <w:sz w:val="22"/>
+          <w:szCs w:val="22"/>
+        </w:rPr>
+        <w:t xml:space="preserve">2. 《中华人民共和国数据安全法》（2021年公布施行） / 第三十一条 重要数据出境安全评估</w:t>
+      </w:r>
+    </w:p>
+    <w:p>
+      <w:pPr>
+        <w:spacing w:after="110" w:line="348" w:lineRule="auto"/>
+        <w:ind w:firstLine="440"/>
+      </w:pPr>
+      <w:r>
+        <w:rPr>
+          <w:rFonts w:ascii="SimSun" w:eastAsia="SimSun" w:hAnsi="SimSun"/>
+          <w:sz w:val="22"/>
+          <w:szCs w:val="22"/>
+        </w:rPr>
+        <w:t xml:space="preserve">关联程度：当前缺少必要上下文，暂无法判断。</w:t>
+      </w:r>
+    </w:p>
+    <w:p>
+      <w:pPr>
+        <w:spacing w:after="110" w:line="348" w:lineRule="auto"/>
+        <w:ind w:firstLine="440"/>
+      </w:pPr>
+      <w:r>
+        <w:rPr>
+          <w:rFonts w:ascii="SimSun" w:eastAsia="SimSun" w:hAnsi="SimSun"/>
+          <w:sz w:val="22"/>
+          <w:szCs w:val="22"/>
+        </w:rPr>
+        <w:t xml:space="preserve">说明：该条款与案件命中分析所关联的控制项存在知识映射，供人工进一步核实。</w:t>
+      </w:r>
+    </w:p>
+    <w:p>
+      <w:pPr>
+        <w:spacing w:after="110" w:line="348" w:lineRule="auto"/>
+        <w:ind w:firstLine="440"/>
+      </w:pPr>
+      <w:r>
+        <w:rPr>
+          <w:rFonts w:ascii="SimSun" w:eastAsia="SimSun" w:hAnsi="SimSun"/>
+          <w:sz w:val="22"/>
+          <w:szCs w:val="22"/>
+        </w:rPr>
+        <w:t xml:space="preserve">版本依据：案件日期 2026-08-08 适用版本 2021-original。</w:t>
+      </w:r>
+    </w:p>
+    <w:p>
+      <w:pPr>
+        <w:spacing w:after="110" w:line="348" w:lineRule="auto"/>
+        <w:ind w:firstLine="440"/>
+      </w:pPr>
+      <w:r>
+        <w:rPr>
+          <w:rFonts w:ascii="SimSun" w:eastAsia="SimSun" w:hAnsi="SimSun"/>
+          <w:sz w:val="22"/>
+          <w:szCs w:val="22"/>
+        </w:rPr>
+        <w:t xml:space="preserve">关联控制：CTRL-DATA-EXPORT-01。</w:t>
+      </w:r>
+    </w:p>
+    <w:p>
+      <w:pPr>
+        <w:spacing w:after="70" w:line="348" w:lineRule="auto"/>
+        <w:ind w:left="220"/>
+      </w:pPr>
+      <w:r>
+        <w:rPr>
+          <w:rFonts w:ascii="SimSun" w:eastAsia="SimSun" w:hAnsi="SimSun"/>
+          <w:sz w:val="22"/>
+          <w:szCs w:val="22"/>
+        </w:rPr>
+        <w:t xml:space="preserve">3. 《中华人民共和国数据安全法》（2021年公布施行） / 第三十二条 依法留存与提供数据</w:t>
+      </w:r>
+    </w:p>
+    <w:p>
+      <w:pPr>
+        <w:spacing w:after="110" w:line="348" w:lineRule="auto"/>
+        <w:ind w:firstLine="440"/>
+      </w:pPr>
+      <w:r>
+        <w:rPr>
+          <w:rFonts w:ascii="SimSun" w:eastAsia="SimSun" w:hAnsi="SimSun"/>
+          <w:sz w:val="22"/>
+          <w:szCs w:val="22"/>
+        </w:rPr>
+        <w:t xml:space="preserve">关联程度：当前缺少必要上下文，暂无法判断。</w:t>
+      </w:r>
+    </w:p>
+    <w:p>
+      <w:pPr>
+        <w:spacing w:after="110" w:line="348" w:lineRule="auto"/>
+        <w:ind w:firstLine="440"/>
+      </w:pPr>
+      <w:r>
+        <w:rPr>
+          <w:rFonts w:ascii="SimSun" w:eastAsia="SimSun" w:hAnsi="SimSun"/>
+          <w:sz w:val="22"/>
+          <w:szCs w:val="22"/>
+        </w:rPr>
+        <w:t xml:space="preserve">说明：该条款与案件命中分析所关联的控制项存在知识映射，供人工进一步核实。</w:t>
+      </w:r>
+    </w:p>
+    <w:p>
+      <w:pPr>
+        <w:spacing w:after="110" w:line="348" w:lineRule="auto"/>
+        <w:ind w:firstLine="440"/>
+      </w:pPr>
+      <w:r>
+        <w:rPr>
+          <w:rFonts w:ascii="SimSun" w:eastAsia="SimSun" w:hAnsi="SimSun"/>
+          <w:sz w:val="22"/>
+          <w:szCs w:val="22"/>
+        </w:rPr>
+        <w:t xml:space="preserve">版本依据：案件日期 2026-08-08 适用版本 2021-original。</w:t>
+      </w:r>
+    </w:p>
+    <w:p>
+      <w:pPr>
+        <w:spacing w:after="110" w:line="348" w:lineRule="auto"/>
+        <w:ind w:firstLine="440"/>
+      </w:pPr>
+      <w:r>
+        <w:rPr>
+          <w:rFonts w:ascii="SimSun" w:eastAsia="SimSun" w:hAnsi="SimSun"/>
+          <w:sz w:val="22"/>
+          <w:szCs w:val="22"/>
+        </w:rPr>
+        <w:t xml:space="preserve">关联控制：CTRL-DATA-EXPORT-01。</w:t>
+      </w:r>
+    </w:p>
+    <w:p>
+      <w:pPr>
+        <w:spacing w:after="70" w:line="348" w:lineRule="auto"/>
+        <w:ind w:left="220"/>
+      </w:pPr>
+      <w:r>
+        <w:rPr>
+          <w:rFonts w:ascii="SimSun" w:eastAsia="SimSun" w:hAnsi="SimSun"/>
+          <w:sz w:val="22"/>
+          <w:szCs w:val="22"/>
+        </w:rPr>
+        <w:t xml:space="preserve">4. 《网络数据安全管理条例》（2024年公布（2025年施行）） / 第三十六条 出境与跨境传输相关要求（要点）</w:t>
+      </w:r>
+    </w:p>
+    <w:p>
+      <w:pPr>
+        <w:spacing w:after="110" w:line="348" w:lineRule="auto"/>
+        <w:ind w:firstLine="440"/>
+      </w:pPr>
+      <w:r>
+        <w:rPr>
+          <w:rFonts w:ascii="SimSun" w:eastAsia="SimSun" w:hAnsi="SimSun"/>
+          <w:sz w:val="22"/>
+          <w:szCs w:val="22"/>
+        </w:rPr>
+        <w:t xml:space="preserve">关联程度：当前缺少必要上下文，暂无法判断。</w:t>
+      </w:r>
+    </w:p>
+    <w:p>
+      <w:pPr>
+        <w:spacing w:after="110" w:line="348" w:lineRule="auto"/>
+        <w:ind w:firstLine="440"/>
+      </w:pPr>
+      <w:r>
+        <w:rPr>
+          <w:rFonts w:ascii="SimSun" w:eastAsia="SimSun" w:hAnsi="SimSun"/>
+          <w:sz w:val="22"/>
+          <w:szCs w:val="22"/>
+        </w:rPr>
+        <w:t xml:space="preserve">说明：该条款与案件命中分析所关联的控制项存在知识映射，供人工进一步核实。</w:t>
+      </w:r>
+    </w:p>
+    <w:p>
+      <w:pPr>
+        <w:spacing w:after="110" w:line="348" w:lineRule="auto"/>
+        <w:ind w:firstLine="440"/>
+      </w:pPr>
+      <w:r>
+        <w:rPr>
+          <w:rFonts w:ascii="SimSun" w:eastAsia="SimSun" w:hAnsi="SimSun"/>
+          <w:sz w:val="22"/>
+          <w:szCs w:val="22"/>
+        </w:rPr>
+        <w:t xml:space="preserve">版本依据：案件日期 2026-08-08 适用版本 2024-original。</w:t>
+      </w:r>
+    </w:p>
+    <w:p>
+      <w:pPr>
+        <w:spacing w:after="110" w:line="348" w:lineRule="auto"/>
+        <w:ind w:firstLine="440"/>
+      </w:pPr>
+      <w:r>
+        <w:rPr>
+          <w:rFonts w:ascii="SimSun" w:eastAsia="SimSun" w:hAnsi="SimSun"/>
+          <w:sz w:val="22"/>
+          <w:szCs w:val="22"/>
+        </w:rPr>
+        <w:t xml:space="preserve">关联控制：CTRL-DATA-EXPORT-01。</w:t>
       </w:r>
     </w:p>
     <w:p>

</xml_diff>